<commit_message>
Agregada la integracion con Moodle como diferencial sobre exam.net
</commit_message>
<xml_diff>
--- a/Trabajo Final - Examline Multiparte.docx
+++ b/Trabajo Final - Examline Multiparte.docx
@@ -291,8 +291,16 @@
       </w:r>
     </w:p>
     <w:p>
+      <w:pPr>
+        <w:pStyle w:val="ListBullet"/>
+      </w:pPr>
       <w:r>
-        <w:t>De estos puntos, Examline ya contaba, antes de este trabajo, con solución propia para la carga y utilización de archivos TXT/CSV y para la carga de código inicial en ejercicios de programación (funcionalidades incorporadas en desarrollos previos de la plataforma). El aporte específico de este trabajo es exclusivamente el soporte de exámenes multiparte y la imagen por pregunta; ambos se documentan en la Solución Propuesta. Es importante notar, a modo de honestidad intelectual, que Examline tampoco soporta hoy lenguajes de programación por fuera de Python y JavaScript (la misma limitación que Exam.net en ese punto específico); esa paridad, y no una ventaja, queda registrada también en la sección de Futuras Discusiones.</w:t>
+        <w:t>Exam.net no tiene integración con Moodle: se buscó el término "moodle" en la totalidad de su sitio de soporte (0 resultados) y también el término "LTI" (Learning Tools Interoperability), el protocolo estándar que Moodle usa para conectar herramientas externas (0 resultados). Su propia página oficial de integraciones LMS confirma que solo integra con Google Classroom y Microsoft Teams for Education [5], sin mencionar Moodle en ningún punto.</w:t>
+      </w:r>
+    </w:p>
+    <w:p>
+      <w:r>
+        <w:t>De estos puntos, Examline ya contaba, antes de este trabajo, con solución propia para la carga y utilización de archivos TXT/CSV, para la carga de código inicial en ejercicios de programación, y con una integración propia con Moodle (verificación de conexión, lectura de cursos/actividades, y sincronización automática de calificaciones por ventana de examen) — funcionalidades incorporadas en desarrollos previos de la plataforma, particularmente relevantes dado que Moodle es el LMS utilizado por la propia UCA. El aporte específico de este trabajo es exclusivamente el soporte de exámenes multiparte y la imagen por pregunta; ambos se documentan en la Solución Propuesta. Es importante notar, a modo de honestidad intelectual, que Examline tampoco soporta hoy lenguajes de programación por fuera de Python y JavaScript (la misma limitación que Exam.net en ese punto específico); esa paridad, y no una ventaja, queda registrada también en la sección de Futuras Discusiones.</w:t>
       </w:r>
     </w:p>
     <w:p>
@@ -595,7 +603,12 @@
     </w:p>
     <w:p>
       <w:r>
-        <w:t>[5] "Prisma ORM documentation". Prisma. https://www.prisma.io/docs</w:t>
+        <w:t>[5] "Agilice el flujo de trabajo de los exámenes con la integración de LMS". Exam.net. https://exam.net/es/streamline-exam-workflow-with-lms-integration</w:t>
+      </w:r>
+    </w:p>
+    <w:p>
+      <w:r>
+        <w:t>[6] "Prisma ORM documentation". Prisma. https://www.prisma.io/docs</w:t>
       </w:r>
     </w:p>
     <w:p>

</xml_diff>